<commit_message>
refactor(web): removed excess files left from the refactoring process
</commit_message>
<xml_diff>
--- a/docs/SDD_CebuNest_Saligue.docx
+++ b/docs/SDD_CebuNest_Saligue.docx
@@ -1,6 +1,6 @@
 
 <file path=word/document.xml><?xml version="1.0" encoding="utf-8"?>
-<w:document xmlns:wpc="http://schemas.microsoft.com/office/word/2010/wordprocessingCanvas" xmlns:cx="http://schemas.microsoft.com/office/drawing/2014/chartex" xmlns:cx1="http://schemas.microsoft.com/office/drawing/2015/9/8/chartex" xmlns:cx2="http://schemas.microsoft.com/office/drawing/2015/10/21/chartex" xmlns:cx3="http://schemas.microsoft.com/office/drawing/2016/5/9/chartex" xmlns:cx4="http://schemas.microsoft.com/office/drawing/2016/5/10/chartex" xmlns:cx5="http://schemas.microsoft.com/office/drawing/2016/5/11/chartex" xmlns:cx6="http://schemas.microsoft.com/office/drawing/2016/5/12/chartex" xmlns:cx7="http://schemas.microsoft.com/office/drawing/2016/5/13/chartex" xmlns:cx8="http://schemas.microsoft.com/office/drawing/2016/5/14/chartex" xmlns:mc="http://schemas.openxmlformats.org/markup-compatibility/2006" xmlns:aink="http://schemas.microsoft.com/office/drawing/2016/ink" xmlns:am3d="http://schemas.microsoft.com/office/drawing/2017/model3d" xmlns:o="urn:schemas-microsoft-com:office:office" xmlns:r="http://schemas.openxmlformats.org/officeDocument/2006/relationships" xmlns:m="http://schemas.openxmlformats.org/officeDocument/2006/math" xmlns:v="urn:schemas-microsoft-com:vml" xmlns:wp14="http://schemas.microsoft.com/office/word/2010/wordprocessingDrawing" xmlns:wp="http://schemas.openxmlformats.org/drawingml/2006/wordprocessingDrawing" xmlns:w10="urn:schemas-microsoft-com:office:word" xmlns:w="http://schemas.openxmlformats.org/wordprocessingml/2006/main" xmlns:w14="http://schemas.microsoft.com/office/word/2010/wordml" xmlns:w15="http://schemas.microsoft.com/office/word/2012/wordml" xmlns:w16cid="http://schemas.microsoft.com/office/word/2016/wordml/cid" xmlns:w16se="http://schemas.microsoft.com/office/word/2015/wordml/symex" xmlns:wpg="http://schemas.microsoft.com/office/word/2010/wordprocessingGroup" xmlns:wpi="http://schemas.microsoft.com/office/word/2010/wordprocessingInk" xmlns:wne="http://schemas.microsoft.com/office/word/2006/wordml" xmlns:wps="http://schemas.microsoft.com/office/word/2010/wordprocessingShape" mc:Ignorable="w14 w15 w16se w16cid wp14">
+<w:document xmlns:wpc="http://schemas.microsoft.com/office/word/2010/wordprocessingCanvas" xmlns:cx="http://schemas.microsoft.com/office/drawing/2014/chartex" xmlns:cx1="http://schemas.microsoft.com/office/drawing/2015/9/8/chartex" xmlns:cx2="http://schemas.microsoft.com/office/drawing/2015/10/21/chartex" xmlns:cx3="http://schemas.microsoft.com/office/drawing/2016/5/9/chartex" xmlns:cx4="http://schemas.microsoft.com/office/drawing/2016/5/10/chartex" xmlns:cx5="http://schemas.microsoft.com/office/drawing/2016/5/11/chartex" xmlns:cx6="http://schemas.microsoft.com/office/drawing/2016/5/12/chartex" xmlns:cx7="http://schemas.microsoft.com/office/drawing/2016/5/13/chartex" xmlns:cx8="http://schemas.microsoft.com/office/drawing/2016/5/14/chartex" xmlns:mc="http://schemas.openxmlformats.org/markup-compatibility/2006" xmlns:aink="http://schemas.microsoft.com/office/drawing/2016/ink" xmlns:am3d="http://schemas.microsoft.com/office/drawing/2017/model3d" xmlns:o="urn:schemas-microsoft-com:office:office" xmlns:oel="http://schemas.microsoft.com/office/2019/extlst" xmlns:r="http://schemas.openxmlformats.org/officeDocument/2006/relationships" xmlns:m="http://schemas.openxmlformats.org/officeDocument/2006/math" xmlns:v="urn:schemas-microsoft-com:vml" xmlns:wp14="http://schemas.microsoft.com/office/word/2010/wordprocessingDrawing" xmlns:wp="http://schemas.openxmlformats.org/drawingml/2006/wordprocessingDrawing" xmlns:w10="urn:schemas-microsoft-com:office:word" xmlns:w="http://schemas.openxmlformats.org/wordprocessingml/2006/main" xmlns:w14="http://schemas.microsoft.com/office/word/2010/wordml" xmlns:w15="http://schemas.microsoft.com/office/word/2012/wordml" xmlns:w16cex="http://schemas.microsoft.com/office/word/2018/wordml/cex" xmlns:w16cid="http://schemas.microsoft.com/office/word/2016/wordml/cid" xmlns:w16="http://schemas.microsoft.com/office/word/2018/wordml" xmlns:w16du="http://schemas.microsoft.com/office/word/2023/wordml/word16du" xmlns:w16sdtdh="http://schemas.microsoft.com/office/word/2020/wordml/sdtdatahash" xmlns:w16sdtfl="http://schemas.microsoft.com/office/word/2024/wordml/sdtformatlock" xmlns:w16se="http://schemas.microsoft.com/office/word/2015/wordml/symex" xmlns:wpg="http://schemas.microsoft.com/office/word/2010/wordprocessingGroup" xmlns:wpi="http://schemas.microsoft.com/office/word/2010/wordprocessingInk" xmlns:wne="http://schemas.microsoft.com/office/word/2006/wordml" xmlns:wps="http://schemas.microsoft.com/office/word/2010/wordprocessingShape" mc:Ignorable="w14 w15 w16se w16cid w16 w16cex w16sdtdh w16sdtfl w16du wp14">
   <w:body>
     <w:p>
       <w:pPr>
@@ -22,7 +22,7 @@
           <w:noProof/>
         </w:rPr>
         <w:drawing>
-          <wp:inline distT="0" distB="0" distL="0" distR="0">
+          <wp:inline distT="0" distB="0" distL="0" distR="0" wp14:anchorId="269B4B07" wp14:editId="2E9A16B3">
             <wp:extent cx="5943600" cy="1166495"/>
             <wp:effectExtent l="0" t="0" r="0" b="0"/>
             <wp:docPr id="67" name="Picture 67"/>
@@ -119,7 +119,7 @@
         <mc:AlternateContent>
           <mc:Choice Requires="wpg">
             <w:drawing>
-              <wp:inline distT="0" distB="0" distL="0" distR="0">
+              <wp:inline distT="0" distB="0" distL="0" distR="0" wp14:anchorId="68658B9E" wp14:editId="1AAA2E40">
                 <wp:extent cx="5944870" cy="20701"/>
                 <wp:effectExtent l="0" t="0" r="0" b="0"/>
                 <wp:docPr id="39329" name="Group 39329"/>
@@ -705,7 +705,7 @@
         <mc:AlternateContent>
           <mc:Choice Requires="wpg">
             <w:drawing>
-              <wp:inline distT="0" distB="0" distL="0" distR="0">
+              <wp:inline distT="0" distB="0" distL="0" distR="0" wp14:anchorId="0DBD1EC6" wp14:editId="2B525D62">
                 <wp:extent cx="5944870" cy="20447"/>
                 <wp:effectExtent l="0" t="0" r="0" b="0"/>
                 <wp:docPr id="39333" name="Group 39333"/>
@@ -1300,21 +1300,7 @@
         <w:rPr>
           <w:sz w:val="32"/>
         </w:rPr>
-        <w:t xml:space="preserve">Prepared By: </w:t>
-      </w:r>
-      <w:proofErr w:type="spellStart"/>
-      <w:r>
-        <w:rPr>
-          <w:sz w:val="32"/>
-        </w:rPr>
-        <w:t>Saligue</w:t>
-      </w:r>
-      <w:proofErr w:type="spellEnd"/>
-      <w:r>
-        <w:rPr>
-          <w:sz w:val="32"/>
-        </w:rPr>
-        <w:t xml:space="preserve">, Kean Maverick </w:t>
+        <w:t xml:space="preserve">Prepared By: Saligue, Kean Maverick </w:t>
       </w:r>
     </w:p>
     <w:p>
@@ -1668,23 +1654,7 @@
                 <w:color w:val="0F1115"/>
                 <w:sz w:val="24"/>
               </w:rPr>
-              <w:t xml:space="preserve">Kean Maverick </w:t>
-            </w:r>
-            <w:proofErr w:type="spellStart"/>
-            <w:r>
-              <w:rPr>
-                <w:color w:val="0F1115"/>
-                <w:sz w:val="24"/>
-              </w:rPr>
-              <w:t>Saligue</w:t>
-            </w:r>
-            <w:proofErr w:type="spellEnd"/>
-            <w:r>
-              <w:rPr>
-                <w:color w:val="0F1115"/>
-                <w:sz w:val="24"/>
-              </w:rPr>
-              <w:t xml:space="preserve"> </w:t>
+              <w:t xml:space="preserve">Kean Maverick Saligue </w:t>
             </w:r>
           </w:p>
         </w:tc>
@@ -1860,7 +1830,6 @@
             </w:r>
           </w:p>
           <w:p>
-            <w:proofErr w:type="spellStart"/>
             <w:r>
               <w:rPr>
                 <w:color w:val="0F1115"/>
@@ -1868,7 +1837,6 @@
               </w:rPr>
               <w:t>Saligue</w:t>
             </w:r>
-            <w:proofErr w:type="spellEnd"/>
             <w:r>
               <w:rPr>
                 <w:color w:val="0F1115"/>
@@ -7336,7 +7304,7 @@
         <mc:AlternateContent>
           <mc:Choice Requires="wpg">
             <w:drawing>
-              <wp:inline distT="0" distB="0" distL="0" distR="0">
+              <wp:inline distT="0" distB="0" distL="0" distR="0" wp14:anchorId="11D54F12" wp14:editId="3F47308B">
                 <wp:extent cx="5944870" cy="20193"/>
                 <wp:effectExtent l="0" t="0" r="0" b="0"/>
                 <wp:docPr id="39430" name="Group 39430"/>
@@ -8091,7 +8059,7 @@
         <mc:AlternateContent>
           <mc:Choice Requires="wpg">
             <w:drawing>
-              <wp:inline distT="0" distB="0" distL="0" distR="0">
+              <wp:inline distT="0" distB="0" distL="0" distR="0" wp14:anchorId="291E1785" wp14:editId="027906B0">
                 <wp:extent cx="5944870" cy="20701"/>
                 <wp:effectExtent l="0" t="0" r="0" b="0"/>
                 <wp:docPr id="39431" name="Group 39431"/>
@@ -8938,7 +8906,7 @@
         <mc:AlternateContent>
           <mc:Choice Requires="wpg">
             <w:drawing>
-              <wp:inline distT="0" distB="0" distL="0" distR="0">
+              <wp:inline distT="0" distB="0" distL="0" distR="0" wp14:anchorId="78023858" wp14:editId="083880D6">
                 <wp:extent cx="5944870" cy="19812"/>
                 <wp:effectExtent l="0" t="0" r="0" b="0"/>
                 <wp:docPr id="40155" name="Group 40155"/>
@@ -9681,7 +9649,7 @@
         <mc:AlternateContent>
           <mc:Choice Requires="wpg">
             <w:drawing>
-              <wp:inline distT="0" distB="0" distL="0" distR="0">
+              <wp:inline distT="0" distB="0" distL="0" distR="0" wp14:anchorId="7AB33554" wp14:editId="4811E26F">
                 <wp:extent cx="5944870" cy="20193"/>
                 <wp:effectExtent l="0" t="0" r="0" b="0"/>
                 <wp:docPr id="40161" name="Group 40161"/>
@@ -10393,6 +10361,9 @@
       <w:pPr>
         <w:spacing w:after="4" w:line="270" w:lineRule="auto"/>
         <w:ind w:left="-5" w:right="3046" w:hanging="10"/>
+        <w:rPr>
+          <w:sz w:val="24"/>
+        </w:rPr>
       </w:pPr>
       <w:r>
         <w:rPr>
@@ -10407,6 +10378,12 @@
         </w:rPr>
         <w:t xml:space="preserve"> And the property becomes visible to tenants in the property listings </w:t>
       </w:r>
+    </w:p>
+    <w:p>
+      <w:pPr>
+        <w:spacing w:after="4" w:line="270" w:lineRule="auto"/>
+        <w:ind w:left="-5" w:right="3046" w:hanging="10"/>
+      </w:pPr>
       <w:r>
         <w:rPr>
           <w:rFonts w:ascii="Segoe UI Symbol" w:eastAsia="Segoe UI Symbol" w:hAnsi="Segoe UI Symbol" w:cs="Segoe UI Symbol"/>
@@ -10522,7 +10499,7 @@
         <mc:AlternateContent>
           <mc:Choice Requires="wpg">
             <w:drawing>
-              <wp:inline distT="0" distB="0" distL="0" distR="0">
+              <wp:inline distT="0" distB="0" distL="0" distR="0" wp14:anchorId="71288D2B" wp14:editId="3BBCAA73">
                 <wp:extent cx="5944870" cy="20065"/>
                 <wp:effectExtent l="0" t="0" r="0" b="0"/>
                 <wp:docPr id="40438" name="Group 40438"/>
@@ -11530,7 +11507,7 @@
         <mc:AlternateContent>
           <mc:Choice Requires="wpg">
             <w:drawing>
-              <wp:anchor distT="0" distB="0" distL="114300" distR="114300" simplePos="0" relativeHeight="251658240" behindDoc="1" locked="0" layoutInCell="1" allowOverlap="1">
+              <wp:anchor distT="0" distB="0" distL="114300" distR="114300" simplePos="0" relativeHeight="251658240" behindDoc="1" locked="0" layoutInCell="1" allowOverlap="1" wp14:anchorId="4FE3D31F" wp14:editId="722721D4">
                 <wp:simplePos x="0" y="0"/>
                 <wp:positionH relativeFrom="column">
                   <wp:posOffset>457149</wp:posOffset>
@@ -12069,7 +12046,7 @@
           <w:noProof/>
         </w:rPr>
         <w:drawing>
-          <wp:inline distT="0" distB="0" distL="0" distR="0">
+          <wp:inline distT="0" distB="0" distL="0" distR="0" wp14:anchorId="6249AC7D" wp14:editId="3F6B1598">
             <wp:extent cx="5943600" cy="3033395"/>
             <wp:effectExtent l="0" t="0" r="0" b="0"/>
             <wp:docPr id="2299" name="Picture 2299"/>
@@ -12306,21 +12283,7 @@
         <w:rPr>
           <w:sz w:val="24"/>
         </w:rPr>
-        <w:t>/</w:t>
-      </w:r>
-      <w:proofErr w:type="spellStart"/>
-      <w:r>
-        <w:rPr>
-          <w:sz w:val="24"/>
-        </w:rPr>
-        <w:t>Netlify</w:t>
-      </w:r>
-      <w:proofErr w:type="spellEnd"/>
-      <w:r>
-        <w:rPr>
-          <w:sz w:val="24"/>
-        </w:rPr>
-        <w:t xml:space="preserve"> (Web), APK (Mobile) </w:t>
+        <w:t xml:space="preserve">/Netlify (Web), APK (Mobile) </w:t>
       </w:r>
     </w:p>
     <w:p>
@@ -15005,7 +14968,7 @@
         <mc:AlternateContent>
           <mc:Choice Requires="wpg">
             <w:drawing>
-              <wp:inline distT="0" distB="0" distL="0" distR="0">
+              <wp:inline distT="0" distB="0" distL="0" distR="0" wp14:anchorId="0A284E6D" wp14:editId="475555C8">
                 <wp:extent cx="5944870" cy="20701"/>
                 <wp:effectExtent l="0" t="0" r="0" b="0"/>
                 <wp:docPr id="48274" name="Group 48274"/>
@@ -19420,7 +19383,7 @@
         <mc:AlternateContent>
           <mc:Choice Requires="wpg">
             <w:drawing>
-              <wp:inline distT="0" distB="0" distL="0" distR="0">
+              <wp:inline distT="0" distB="0" distL="0" distR="0" wp14:anchorId="2FC8BD9D" wp14:editId="431EEF5A">
                 <wp:extent cx="5944870" cy="20701"/>
                 <wp:effectExtent l="0" t="0" r="0" b="0"/>
                 <wp:docPr id="49667" name="Group 49667"/>
@@ -20324,8 +20287,13 @@
             </w:r>
             <w:proofErr w:type="spellEnd"/>
             <w:r>
-              <w:t>": &lt;Integer&gt; }</w:t>
-            </w:r>
+              <w:t>": &lt;Integer</w:t>
+            </w:r>
+            <w:proofErr w:type="gramStart"/>
+            <w:r>
+              <w:t>&gt; }</w:t>
+            </w:r>
+            <w:proofErr w:type="gramEnd"/>
           </w:p>
         </w:tc>
       </w:tr>
@@ -20393,15 +20361,7 @@
             </w:r>
             <w:proofErr w:type="spellEnd"/>
             <w:r>
-              <w:t xml:space="preserve">": "N. </w:t>
-            </w:r>
-            <w:proofErr w:type="spellStart"/>
-            <w:r>
-              <w:t>Bacalso</w:t>
-            </w:r>
-            <w:proofErr w:type="spellEnd"/>
-            <w:r>
-              <w:t xml:space="preserve"> Ave, Cebu City", "</w:t>
+              <w:t>": "N. Bacalso Ave, Cebu City", "</w:t>
             </w:r>
             <w:proofErr w:type="spellStart"/>
             <w:r>
@@ -20956,7 +20916,23 @@
             </w:r>
             <w:proofErr w:type="gramEnd"/>
             <w:r>
-              <w:t>success": true, "data": { "requests": [ { "&lt;</w:t>
+              <w:t xml:space="preserve">success": true, "data": </w:t>
+            </w:r>
+            <w:proofErr w:type="gramStart"/>
+            <w:r>
+              <w:t>{ "</w:t>
+            </w:r>
+            <w:proofErr w:type="gramEnd"/>
+            <w:r>
+              <w:t xml:space="preserve">requests": [ </w:t>
+            </w:r>
+            <w:proofErr w:type="gramStart"/>
+            <w:r>
+              <w:t>{ "</w:t>
+            </w:r>
+            <w:proofErr w:type="gramEnd"/>
+            <w:r>
+              <w:t>&lt;</w:t>
             </w:r>
             <w:proofErr w:type="spellStart"/>
             <w:r>
@@ -20964,8 +20940,29 @@
             </w:r>
             <w:proofErr w:type="spellEnd"/>
             <w:r>
-              <w:t xml:space="preserve"> Object&gt;" } ] }, "error": null, "timestamp": "&lt;timestamp&gt;" }</w:t>
-            </w:r>
+              <w:t xml:space="preserve"> Object&gt;</w:t>
+            </w:r>
+            <w:proofErr w:type="gramStart"/>
+            <w:r>
+              <w:t>" }</w:t>
+            </w:r>
+            <w:proofErr w:type="gramEnd"/>
+            <w:r>
+              <w:t xml:space="preserve"> </w:t>
+            </w:r>
+            <w:proofErr w:type="gramStart"/>
+            <w:r>
+              <w:t>] }</w:t>
+            </w:r>
+            <w:proofErr w:type="gramEnd"/>
+            <w:r>
+              <w:t>, "error": null, "timestamp": "&lt;timestamp&gt;</w:t>
+            </w:r>
+            <w:proofErr w:type="gramStart"/>
+            <w:r>
+              <w:t>" }</w:t>
+            </w:r>
+            <w:proofErr w:type="gramEnd"/>
           </w:p>
         </w:tc>
         <w:tc>
@@ -21399,15 +21396,28 @@
             </w:r>
             <w:proofErr w:type="gramEnd"/>
             <w:r>
-              <w:t>success": true, "data": { "</w:t>
+              <w:t xml:space="preserve">success": true, "data": </w:t>
+            </w:r>
+            <w:proofErr w:type="gramStart"/>
+            <w:r>
+              <w:t>{ "</w:t>
             </w:r>
             <w:proofErr w:type="spellStart"/>
+            <w:proofErr w:type="gramEnd"/>
             <w:r>
               <w:t>activeTenant</w:t>
             </w:r>
             <w:proofErr w:type="spellEnd"/>
             <w:r>
-              <w:t>": { "&lt;</w:t>
+              <w:t xml:space="preserve">": </w:t>
+            </w:r>
+            <w:proofErr w:type="gramStart"/>
+            <w:r>
+              <w:t>{ "</w:t>
+            </w:r>
+            <w:proofErr w:type="gramEnd"/>
+            <w:r>
+              <w:t>&lt;</w:t>
             </w:r>
             <w:proofErr w:type="spellStart"/>
             <w:r>
@@ -21415,8 +21425,21 @@
             </w:r>
             <w:proofErr w:type="spellEnd"/>
             <w:r>
-              <w:t xml:space="preserve"> Object representing CONFIRMED request&gt;" } }, "error": null, "timestamp": "&lt;timestamp&gt;" }</w:t>
-            </w:r>
+              <w:t xml:space="preserve"> Object representing CONFIRMED request&gt;</w:t>
+            </w:r>
+            <w:proofErr w:type="gramStart"/>
+            <w:r>
+              <w:t>" }</w:t>
+            </w:r>
+            <w:proofErr w:type="gramEnd"/>
+            <w:r>
+              <w:t xml:space="preserve"> }, "error": null, "timestamp": "&lt;timestamp&gt;</w:t>
+            </w:r>
+            <w:proofErr w:type="gramStart"/>
+            <w:r>
+              <w:t>" }</w:t>
+            </w:r>
+            <w:proofErr w:type="gramEnd"/>
           </w:p>
         </w:tc>
         <w:tc>
@@ -21862,7 +21885,23 @@
             </w:r>
             <w:proofErr w:type="gramEnd"/>
             <w:r>
-              <w:t>success": true, "data": { "requests": [ { "&lt;</w:t>
+              <w:t xml:space="preserve">success": true, "data": </w:t>
+            </w:r>
+            <w:proofErr w:type="gramStart"/>
+            <w:r>
+              <w:t>{ "</w:t>
+            </w:r>
+            <w:proofErr w:type="gramEnd"/>
+            <w:r>
+              <w:t xml:space="preserve">requests": [ </w:t>
+            </w:r>
+            <w:proofErr w:type="gramStart"/>
+            <w:r>
+              <w:t>{ "</w:t>
+            </w:r>
+            <w:proofErr w:type="gramEnd"/>
+            <w:r>
+              <w:t>&lt;</w:t>
             </w:r>
             <w:proofErr w:type="spellStart"/>
             <w:r>
@@ -21870,8 +21909,29 @@
             </w:r>
             <w:proofErr w:type="spellEnd"/>
             <w:r>
-              <w:t xml:space="preserve"> Object&gt;" } ] }, "error": null, "timestamp": "&lt;timestamp&gt;" }</w:t>
-            </w:r>
+              <w:t xml:space="preserve"> Object&gt;</w:t>
+            </w:r>
+            <w:proofErr w:type="gramStart"/>
+            <w:r>
+              <w:t>" }</w:t>
+            </w:r>
+            <w:proofErr w:type="gramEnd"/>
+            <w:r>
+              <w:t xml:space="preserve"> </w:t>
+            </w:r>
+            <w:proofErr w:type="gramStart"/>
+            <w:r>
+              <w:t>] }</w:t>
+            </w:r>
+            <w:proofErr w:type="gramEnd"/>
+            <w:r>
+              <w:t>, "error": null, "timestamp": "&lt;timestamp&gt;</w:t>
+            </w:r>
+            <w:proofErr w:type="gramStart"/>
+            <w:r>
+              <w:t>" }</w:t>
+            </w:r>
+            <w:proofErr w:type="gramEnd"/>
           </w:p>
         </w:tc>
         <w:tc>
@@ -22391,7 +22451,23 @@
             </w:r>
             <w:proofErr w:type="gramEnd"/>
             <w:r>
-              <w:t>success": true, "data": { "request": { "&lt;</w:t>
+              <w:t xml:space="preserve">success": true, "data": </w:t>
+            </w:r>
+            <w:proofErr w:type="gramStart"/>
+            <w:r>
+              <w:t>{ "</w:t>
+            </w:r>
+            <w:proofErr w:type="gramEnd"/>
+            <w:r>
+              <w:t xml:space="preserve">request": </w:t>
+            </w:r>
+            <w:proofErr w:type="gramStart"/>
+            <w:r>
+              <w:t>{ "</w:t>
+            </w:r>
+            <w:proofErr w:type="gramEnd"/>
+            <w:r>
+              <w:t>&lt;</w:t>
             </w:r>
             <w:proofErr w:type="spellStart"/>
             <w:r>
@@ -22399,8 +22475,21 @@
             </w:r>
             <w:proofErr w:type="spellEnd"/>
             <w:r>
-              <w:t xml:space="preserve"> Object&gt;" } }, "error": null, "timestamp": "&lt;timestamp&gt;" }</w:t>
-            </w:r>
+              <w:t xml:space="preserve"> Object&gt;</w:t>
+            </w:r>
+            <w:proofErr w:type="gramStart"/>
+            <w:r>
+              <w:t>" }</w:t>
+            </w:r>
+            <w:proofErr w:type="gramEnd"/>
+            <w:r>
+              <w:t xml:space="preserve"> }, "error": null, "timestamp": "&lt;timestamp&gt;</w:t>
+            </w:r>
+            <w:proofErr w:type="gramStart"/>
+            <w:r>
+              <w:t>" }</w:t>
+            </w:r>
+            <w:proofErr w:type="gramEnd"/>
           </w:p>
         </w:tc>
         <w:tc>
@@ -22829,8 +22918,13 @@
             </w:r>
             <w:proofErr w:type="spellEnd"/>
             <w:r>
-              <w:t>": &lt;Integer (e.g., 2 or -1)&gt; }</w:t>
-            </w:r>
+              <w:t>": &lt;Integer (e.g., 2 or -1)</w:t>
+            </w:r>
+            <w:proofErr w:type="gramStart"/>
+            <w:r>
+              <w:t>&gt; }</w:t>
+            </w:r>
+            <w:proofErr w:type="gramEnd"/>
           </w:p>
         </w:tc>
         <w:tc>
@@ -22893,7 +22987,23 @@
             </w:r>
             <w:proofErr w:type="gramEnd"/>
             <w:r>
-              <w:t>success": true, "data": { "request": { "&lt;</w:t>
+              <w:t xml:space="preserve">success": true, "data": </w:t>
+            </w:r>
+            <w:proofErr w:type="gramStart"/>
+            <w:r>
+              <w:t>{ "</w:t>
+            </w:r>
+            <w:proofErr w:type="gramEnd"/>
+            <w:r>
+              <w:t xml:space="preserve">request": </w:t>
+            </w:r>
+            <w:proofErr w:type="gramStart"/>
+            <w:r>
+              <w:t>{ "</w:t>
+            </w:r>
+            <w:proofErr w:type="gramEnd"/>
+            <w:r>
+              <w:t>&lt;</w:t>
             </w:r>
             <w:proofErr w:type="spellStart"/>
             <w:r>
@@ -22909,8 +23019,21 @@
             </w:r>
             <w:proofErr w:type="spellEnd"/>
             <w:r>
-              <w:t>&gt;" } }, "error": null, "timestamp": "&lt;timestamp&gt;" }</w:t>
-            </w:r>
+              <w:t>&gt;</w:t>
+            </w:r>
+            <w:proofErr w:type="gramStart"/>
+            <w:r>
+              <w:t>" }</w:t>
+            </w:r>
+            <w:proofErr w:type="gramEnd"/>
+            <w:r>
+              <w:t xml:space="preserve"> }, "error": null, "timestamp": "&lt;timestamp&gt;</w:t>
+            </w:r>
+            <w:proofErr w:type="gramStart"/>
+            <w:r>
+              <w:t>" }</w:t>
+            </w:r>
+            <w:proofErr w:type="gramEnd"/>
           </w:p>
         </w:tc>
         <w:tc>
@@ -23329,7 +23452,23 @@
             </w:r>
             <w:proofErr w:type="gramEnd"/>
             <w:r>
-              <w:t>success": true, "data": { "request": { "&lt;</w:t>
+              <w:t xml:space="preserve">success": true, "data": </w:t>
+            </w:r>
+            <w:proofErr w:type="gramStart"/>
+            <w:r>
+              <w:t>{ "</w:t>
+            </w:r>
+            <w:proofErr w:type="gramEnd"/>
+            <w:r>
+              <w:t xml:space="preserve">request": </w:t>
+            </w:r>
+            <w:proofErr w:type="gramStart"/>
+            <w:r>
+              <w:t>{ "</w:t>
+            </w:r>
+            <w:proofErr w:type="gramEnd"/>
+            <w:r>
+              <w:t>&lt;</w:t>
             </w:r>
             <w:proofErr w:type="spellStart"/>
             <w:r>
@@ -23337,8 +23476,21 @@
             </w:r>
             <w:proofErr w:type="spellEnd"/>
             <w:r>
-              <w:t xml:space="preserve"> Object with status TERMINATED&gt;" } }, "error": null, "timestamp": "&lt;timestamp&gt;" }</w:t>
-            </w:r>
+              <w:t xml:space="preserve"> Object with status TERMINATED&gt;</w:t>
+            </w:r>
+            <w:proofErr w:type="gramStart"/>
+            <w:r>
+              <w:t>" }</w:t>
+            </w:r>
+            <w:proofErr w:type="gramEnd"/>
+            <w:r>
+              <w:t xml:space="preserve"> }, "error": null, "timestamp": "&lt;timestamp&gt;</w:t>
+            </w:r>
+            <w:proofErr w:type="gramStart"/>
+            <w:r>
+              <w:t>" }</w:t>
+            </w:r>
+            <w:proofErr w:type="gramEnd"/>
           </w:p>
         </w:tc>
         <w:tc>
@@ -23403,7 +23555,7 @@
         <mc:AlternateContent>
           <mc:Choice Requires="wpg">
             <w:drawing>
-              <wp:inline distT="0" distB="0" distL="0" distR="0">
+              <wp:inline distT="0" distB="0" distL="0" distR="0" wp14:anchorId="14D115D5" wp14:editId="343F4075">
                 <wp:extent cx="5944870" cy="20193"/>
                 <wp:effectExtent l="0" t="0" r="0" b="0"/>
                 <wp:docPr id="48801" name="Group 48801"/>
@@ -25727,7 +25879,39 @@
             </w:r>
             <w:proofErr w:type="spellEnd"/>
             <w:r>
-              <w:t>": &lt;Long&gt; } Response Structure: { "success": true, "data": { "request": { "&lt;</w:t>
+              <w:t>": &lt;Long</w:t>
+            </w:r>
+            <w:proofErr w:type="gramStart"/>
+            <w:r>
+              <w:t>&gt; }</w:t>
+            </w:r>
+            <w:proofErr w:type="gramEnd"/>
+            <w:r>
+              <w:t xml:space="preserve"> Response Structure: </w:t>
+            </w:r>
+            <w:proofErr w:type="gramStart"/>
+            <w:r>
+              <w:t>{ "</w:t>
+            </w:r>
+            <w:proofErr w:type="gramEnd"/>
+            <w:r>
+              <w:t xml:space="preserve">success": true, "data": </w:t>
+            </w:r>
+            <w:proofErr w:type="gramStart"/>
+            <w:r>
+              <w:t>{ "</w:t>
+            </w:r>
+            <w:proofErr w:type="gramEnd"/>
+            <w:r>
+              <w:t xml:space="preserve">request": </w:t>
+            </w:r>
+            <w:proofErr w:type="gramStart"/>
+            <w:r>
+              <w:t>{ "</w:t>
+            </w:r>
+            <w:proofErr w:type="gramEnd"/>
+            <w:r>
+              <w:t>&lt;</w:t>
             </w:r>
             <w:proofErr w:type="spellStart"/>
             <w:r>
@@ -25743,8 +25927,21 @@
             </w:r>
             <w:proofErr w:type="spellEnd"/>
             <w:r>
-              <w:t xml:space="preserve"> set&gt;" } }, "error": null, "timestamp": "&lt;timestamp&gt;" }</w:t>
-            </w:r>
+              <w:t xml:space="preserve"> set&gt;</w:t>
+            </w:r>
+            <w:proofErr w:type="gramStart"/>
+            <w:r>
+              <w:t>" }</w:t>
+            </w:r>
+            <w:proofErr w:type="gramEnd"/>
+            <w:r>
+              <w:t xml:space="preserve"> }, "error": null, "timestamp": "&lt;timestamp&gt;</w:t>
+            </w:r>
+            <w:proofErr w:type="gramStart"/>
+            <w:r>
+              <w:t>" }</w:t>
+            </w:r>
+            <w:proofErr w:type="gramEnd"/>
           </w:p>
         </w:tc>
       </w:tr>
@@ -26056,8 +26253,13 @@
             </w:r>
             <w:proofErr w:type="spellEnd"/>
             <w:r>
-              <w:t>": &lt;Long&gt; }</w:t>
-            </w:r>
+              <w:t>": &lt;Long</w:t>
+            </w:r>
+            <w:proofErr w:type="gramStart"/>
+            <w:r>
+              <w:t>&gt; }</w:t>
+            </w:r>
+            <w:proofErr w:type="gramEnd"/>
           </w:p>
         </w:tc>
       </w:tr>
@@ -26215,15 +26417,7 @@
             </w:r>
             <w:proofErr w:type="spellEnd"/>
             <w:r>
-              <w:t xml:space="preserve">": "N. </w:t>
-            </w:r>
-            <w:proofErr w:type="spellStart"/>
-            <w:r>
-              <w:t>Bacalso</w:t>
-            </w:r>
-            <w:proofErr w:type="spellEnd"/>
-            <w:r>
-              <w:t xml:space="preserve"> Ave, Cebu City" } ] }, "error": null, "timestamp": "&lt;timestamp&gt;" }</w:t>
+              <w:t>": "N. Bacalso Ave, Cebu City" } ] }, "error": null, "timestamp": "&lt;timestamp&gt;" }</w:t>
             </w:r>
           </w:p>
         </w:tc>
@@ -26537,7 +26731,23 @@
             </w:r>
             <w:proofErr w:type="gramEnd"/>
             <w:r>
-              <w:t>success": true, "data": { "payment": { "&lt;</w:t>
+              <w:t xml:space="preserve">success": true, "data": </w:t>
+            </w:r>
+            <w:proofErr w:type="gramStart"/>
+            <w:r>
+              <w:t>{ "</w:t>
+            </w:r>
+            <w:proofErr w:type="gramEnd"/>
+            <w:r>
+              <w:t xml:space="preserve">payment": </w:t>
+            </w:r>
+            <w:proofErr w:type="gramStart"/>
+            <w:r>
+              <w:t>{ "</w:t>
+            </w:r>
+            <w:proofErr w:type="gramEnd"/>
+            <w:r>
+              <w:t>&lt;</w:t>
             </w:r>
             <w:proofErr w:type="spellStart"/>
             <w:r>
@@ -26561,8 +26771,21 @@
             </w:r>
             <w:proofErr w:type="spellEnd"/>
             <w:r>
-              <w:t>&gt;" } }, "error": null, "timestamp": "&lt;timestamp&gt;" }</w:t>
-            </w:r>
+              <w:t>&gt;</w:t>
+            </w:r>
+            <w:proofErr w:type="gramStart"/>
+            <w:r>
+              <w:t>" }</w:t>
+            </w:r>
+            <w:proofErr w:type="gramEnd"/>
+            <w:r>
+              <w:t xml:space="preserve"> }, "error": null, "timestamp": "&lt;timestamp&gt;</w:t>
+            </w:r>
+            <w:proofErr w:type="gramStart"/>
+            <w:r>
+              <w:t>" }</w:t>
+            </w:r>
+            <w:proofErr w:type="gramEnd"/>
           </w:p>
         </w:tc>
       </w:tr>
@@ -26873,7 +27096,23 @@
             </w:r>
             <w:proofErr w:type="gramEnd"/>
             <w:r>
-              <w:t>success": true, "data": { "payment": { "&lt;</w:t>
+              <w:t xml:space="preserve">success": true, "data": </w:t>
+            </w:r>
+            <w:proofErr w:type="gramStart"/>
+            <w:r>
+              <w:t>{ "</w:t>
+            </w:r>
+            <w:proofErr w:type="gramEnd"/>
+            <w:r>
+              <w:t xml:space="preserve">payment": </w:t>
+            </w:r>
+            <w:proofErr w:type="gramStart"/>
+            <w:r>
+              <w:t>{ "</w:t>
+            </w:r>
+            <w:proofErr w:type="gramEnd"/>
+            <w:r>
+              <w:t>&lt;</w:t>
             </w:r>
             <w:proofErr w:type="spellStart"/>
             <w:r>
@@ -26889,8 +27128,21 @@
             </w:r>
             <w:proofErr w:type="spellEnd"/>
             <w:r>
-              <w:t xml:space="preserve"> timestamp&gt;" } }, "error": null, "timestamp": "&lt;timestamp&gt;" }</w:t>
-            </w:r>
+              <w:t xml:space="preserve"> timestamp&gt;</w:t>
+            </w:r>
+            <w:proofErr w:type="gramStart"/>
+            <w:r>
+              <w:t>" }</w:t>
+            </w:r>
+            <w:proofErr w:type="gramEnd"/>
+            <w:r>
+              <w:t xml:space="preserve"> }, "error": null, "timestamp": "&lt;timestamp&gt;</w:t>
+            </w:r>
+            <w:proofErr w:type="gramStart"/>
+            <w:r>
+              <w:t>" }</w:t>
+            </w:r>
+            <w:proofErr w:type="gramEnd"/>
           </w:p>
         </w:tc>
       </w:tr>
@@ -27192,7 +27444,23 @@
             </w:r>
             <w:proofErr w:type="gramEnd"/>
             <w:r>
-              <w:t>success": true, "data": { "payment": { "&lt;</w:t>
+              <w:t xml:space="preserve">success": true, "data": </w:t>
+            </w:r>
+            <w:proofErr w:type="gramStart"/>
+            <w:r>
+              <w:t>{ "</w:t>
+            </w:r>
+            <w:proofErr w:type="gramEnd"/>
+            <w:r>
+              <w:t xml:space="preserve">payment": </w:t>
+            </w:r>
+            <w:proofErr w:type="gramStart"/>
+            <w:r>
+              <w:t>{ "</w:t>
+            </w:r>
+            <w:proofErr w:type="gramEnd"/>
+            <w:r>
+              <w:t>&lt;</w:t>
             </w:r>
             <w:proofErr w:type="spellStart"/>
             <w:r>
@@ -27200,8 +27468,21 @@
             </w:r>
             <w:proofErr w:type="spellEnd"/>
             <w:r>
-              <w:t xml:space="preserve"> Object with status CANCELLED&gt;" } }, "error": null, "timestamp": "&lt;timestamp&gt;" }</w:t>
-            </w:r>
+              <w:t xml:space="preserve"> Object with status CANCELLED&gt;</w:t>
+            </w:r>
+            <w:proofErr w:type="gramStart"/>
+            <w:r>
+              <w:t>" }</w:t>
+            </w:r>
+            <w:proofErr w:type="gramEnd"/>
+            <w:r>
+              <w:t xml:space="preserve"> }, "error": null, "timestamp": "&lt;timestamp&gt;</w:t>
+            </w:r>
+            <w:proofErr w:type="gramStart"/>
+            <w:r>
+              <w:t>" }</w:t>
+            </w:r>
+            <w:proofErr w:type="gramEnd"/>
           </w:p>
         </w:tc>
       </w:tr>
@@ -27316,10 +27597,7 @@
           </w:tcPr>
           <w:p>
             <w:r>
-              <w:t>/payments/{id}/</w:t>
-            </w:r>
-            <w:r>
-              <w:t>fail</w:t>
+              <w:t>/payments/{id}/fail</w:t>
             </w:r>
           </w:p>
         </w:tc>
@@ -27506,7 +27784,23 @@
             </w:r>
             <w:proofErr w:type="gramEnd"/>
             <w:r>
-              <w:t>success": true, "data": { "payment": { "&lt;</w:t>
+              <w:t xml:space="preserve">success": true, "data": </w:t>
+            </w:r>
+            <w:proofErr w:type="gramStart"/>
+            <w:r>
+              <w:t>{ "</w:t>
+            </w:r>
+            <w:proofErr w:type="gramEnd"/>
+            <w:r>
+              <w:t xml:space="preserve">payment": </w:t>
+            </w:r>
+            <w:proofErr w:type="gramStart"/>
+            <w:r>
+              <w:t>{ "</w:t>
+            </w:r>
+            <w:proofErr w:type="gramEnd"/>
+            <w:r>
+              <w:t>&lt;</w:t>
             </w:r>
             <w:proofErr w:type="spellStart"/>
             <w:r>
@@ -27514,8 +27808,21 @@
             </w:r>
             <w:proofErr w:type="spellEnd"/>
             <w:r>
-              <w:t xml:space="preserve"> Object with status FAILED&gt;" } }, "error": null, "timestamp": "&lt;timestamp&gt;" }</w:t>
-            </w:r>
+              <w:t xml:space="preserve"> Object with status FAILED&gt;</w:t>
+            </w:r>
+            <w:proofErr w:type="gramStart"/>
+            <w:r>
+              <w:t>" }</w:t>
+            </w:r>
+            <w:proofErr w:type="gramEnd"/>
+            <w:r>
+              <w:t xml:space="preserve"> }, "error": null, "timestamp": "&lt;timestamp&gt;</w:t>
+            </w:r>
+            <w:proofErr w:type="gramStart"/>
+            <w:r>
+              <w:t>" }</w:t>
+            </w:r>
+            <w:proofErr w:type="gramEnd"/>
           </w:p>
         </w:tc>
       </w:tr>
@@ -27538,7 +27845,7 @@
         <mc:AlternateContent>
           <mc:Choice Requires="wpg">
             <w:drawing>
-              <wp:inline distT="0" distB="0" distL="0" distR="0">
+              <wp:inline distT="0" distB="0" distL="0" distR="0" wp14:anchorId="79988531" wp14:editId="6B3AADF2">
                 <wp:extent cx="5944870" cy="20828"/>
                 <wp:effectExtent l="0" t="0" r="0" b="0"/>
                 <wp:docPr id="50082" name="Group 50082"/>
@@ -28391,8 +28698,6 @@
               </w:rPr>
               <w:t xml:space="preserve">Role-based </w:t>
             </w:r>
-            <w:bookmarkStart w:id="0" w:name="_GoBack"/>
-            <w:bookmarkEnd w:id="0"/>
           </w:p>
         </w:tc>
       </w:tr>
@@ -29124,7 +29429,7 @@
         <mc:AlternateContent>
           <mc:Choice Requires="wpg">
             <w:drawing>
-              <wp:inline distT="0" distB="0" distL="0" distR="0">
+              <wp:inline distT="0" distB="0" distL="0" distR="0" wp14:anchorId="45301493" wp14:editId="60922863">
                 <wp:extent cx="5944870" cy="20955"/>
                 <wp:effectExtent l="0" t="0" r="0" b="0"/>
                 <wp:docPr id="45076" name="Group 45076"/>
@@ -30444,7 +30749,7 @@
           <w:noProof/>
         </w:rPr>
         <w:drawing>
-          <wp:inline distT="0" distB="0" distL="0" distR="0">
+          <wp:inline distT="0" distB="0" distL="0" distR="0" wp14:anchorId="622447C3" wp14:editId="24E1EFF7">
             <wp:extent cx="5596256" cy="4140454"/>
             <wp:effectExtent l="0" t="0" r="0" b="0"/>
             <wp:docPr id="5564" name="Picture 5564"/>
@@ -30768,7 +31073,7 @@
         <mc:AlternateContent>
           <mc:Choice Requires="wpg">
             <w:drawing>
-              <wp:anchor distT="0" distB="0" distL="114300" distR="114300" simplePos="0" relativeHeight="251659264" behindDoc="1" locked="0" layoutInCell="1" allowOverlap="1">
+              <wp:anchor distT="0" distB="0" distL="114300" distR="114300" simplePos="0" relativeHeight="251659264" behindDoc="1" locked="0" layoutInCell="1" allowOverlap="1" wp14:anchorId="0ABF8E55" wp14:editId="71C3FDCF">
                 <wp:simplePos x="0" y="0"/>
                 <wp:positionH relativeFrom="column">
                   <wp:posOffset>0</wp:posOffset>
@@ -31881,7 +32186,7 @@
           <w:noProof/>
         </w:rPr>
         <w:drawing>
-          <wp:inline distT="0" distB="0" distL="0" distR="0">
+          <wp:inline distT="0" distB="0" distL="0" distR="0" wp14:anchorId="06ECF17A" wp14:editId="4AF891C9">
             <wp:extent cx="5160645" cy="3374771"/>
             <wp:effectExtent l="0" t="0" r="0" b="0"/>
             <wp:docPr id="5792" name="Picture 5792"/>
@@ -31943,7 +32248,7 @@
           <w:noProof/>
         </w:rPr>
         <w:drawing>
-          <wp:inline distT="0" distB="0" distL="0" distR="0">
+          <wp:inline distT="0" distB="0" distL="0" distR="0" wp14:anchorId="3CFDBC43" wp14:editId="6D2C33EC">
             <wp:extent cx="6509385" cy="2411095"/>
             <wp:effectExtent l="0" t="0" r="0" b="0"/>
             <wp:docPr id="5794" name="Picture 5794"/>
@@ -32004,7 +32309,7 @@
           <w:noProof/>
         </w:rPr>
         <w:drawing>
-          <wp:inline distT="0" distB="0" distL="0" distR="0">
+          <wp:inline distT="0" distB="0" distL="0" distR="0" wp14:anchorId="53D0DFEA" wp14:editId="0F2B0587">
             <wp:extent cx="5165090" cy="3185160"/>
             <wp:effectExtent l="0" t="0" r="0" b="0"/>
             <wp:docPr id="5816" name="Picture 5816"/>
@@ -32077,7 +32382,7 @@
           <w:noProof/>
         </w:rPr>
         <w:drawing>
-          <wp:inline distT="0" distB="0" distL="0" distR="0">
+          <wp:inline distT="0" distB="0" distL="0" distR="0" wp14:anchorId="007FC6A4" wp14:editId="40F436B4">
             <wp:extent cx="6623558" cy="3094990"/>
             <wp:effectExtent l="0" t="0" r="0" b="0"/>
             <wp:docPr id="5818" name="Picture 5818"/>
@@ -32162,7 +32467,7 @@
           <w:noProof/>
         </w:rPr>
         <w:drawing>
-          <wp:inline distT="0" distB="0" distL="0" distR="0">
+          <wp:inline distT="0" distB="0" distL="0" distR="0" wp14:anchorId="73E368E9" wp14:editId="763CAFEC">
             <wp:extent cx="5585460" cy="3062605"/>
             <wp:effectExtent l="0" t="0" r="0" b="0"/>
             <wp:docPr id="5835" name="Picture 5835"/>
@@ -32236,7 +32541,7 @@
           <w:noProof/>
         </w:rPr>
         <w:drawing>
-          <wp:inline distT="0" distB="0" distL="0" distR="0">
+          <wp:inline distT="0" distB="0" distL="0" distR="0" wp14:anchorId="1135E58D" wp14:editId="5BB40C97">
             <wp:extent cx="5152009" cy="3826510"/>
             <wp:effectExtent l="0" t="0" r="0" b="0"/>
             <wp:docPr id="5837" name="Picture 5837"/>
@@ -32297,7 +32602,7 @@
           <w:noProof/>
         </w:rPr>
         <w:drawing>
-          <wp:inline distT="0" distB="0" distL="0" distR="0">
+          <wp:inline distT="0" distB="0" distL="0" distR="0" wp14:anchorId="2553E9CE" wp14:editId="1F3D3B5C">
             <wp:extent cx="4107815" cy="2706116"/>
             <wp:effectExtent l="0" t="0" r="0" b="0"/>
             <wp:docPr id="5855" name="Picture 5855"/>
@@ -32359,7 +32664,7 @@
           <w:noProof/>
         </w:rPr>
         <w:drawing>
-          <wp:inline distT="0" distB="0" distL="0" distR="0">
+          <wp:inline distT="0" distB="0" distL="0" distR="0" wp14:anchorId="0B1B02C1" wp14:editId="264560C9">
             <wp:extent cx="5943600" cy="3502025"/>
             <wp:effectExtent l="0" t="0" r="0" b="0"/>
             <wp:docPr id="5857" name="Picture 5857"/>
@@ -32469,7 +32774,7 @@
           <w:noProof/>
         </w:rPr>
         <w:drawing>
-          <wp:inline distT="0" distB="0" distL="0" distR="0">
+          <wp:inline distT="0" distB="0" distL="0" distR="0" wp14:anchorId="4E9EBB1D" wp14:editId="3A7D14F0">
             <wp:extent cx="6500368" cy="3248660"/>
             <wp:effectExtent l="0" t="0" r="0" b="0"/>
             <wp:docPr id="5877" name="Picture 5877"/>
@@ -32542,7 +32847,7 @@
           <w:noProof/>
         </w:rPr>
         <w:drawing>
-          <wp:inline distT="0" distB="0" distL="0" distR="0">
+          <wp:inline distT="0" distB="0" distL="0" distR="0" wp14:anchorId="6B990703" wp14:editId="68AEF766">
             <wp:extent cx="5943600" cy="3133090"/>
             <wp:effectExtent l="0" t="0" r="0" b="0"/>
             <wp:docPr id="5879" name="Picture 5879"/>
@@ -32628,7 +32933,7 @@
           <w:noProof/>
         </w:rPr>
         <w:drawing>
-          <wp:inline distT="0" distB="0" distL="0" distR="0">
+          <wp:inline distT="0" distB="0" distL="0" distR="0" wp14:anchorId="1B55E0E5" wp14:editId="48A166B1">
             <wp:extent cx="5943600" cy="2531110"/>
             <wp:effectExtent l="0" t="0" r="0" b="0"/>
             <wp:docPr id="5903" name="Picture 5903"/>
@@ -32701,7 +33006,7 @@
           <w:noProof/>
         </w:rPr>
         <w:drawing>
-          <wp:inline distT="0" distB="0" distL="0" distR="0">
+          <wp:inline distT="0" distB="0" distL="0" distR="0" wp14:anchorId="72ED624C" wp14:editId="17E10130">
             <wp:extent cx="5943600" cy="2392680"/>
             <wp:effectExtent l="0" t="0" r="0" b="0"/>
             <wp:docPr id="5905" name="Picture 5905"/>
@@ -32852,7 +33157,7 @@
           <w:noProof/>
         </w:rPr>
         <w:drawing>
-          <wp:inline distT="0" distB="0" distL="0" distR="0">
+          <wp:inline distT="0" distB="0" distL="0" distR="0" wp14:anchorId="2DF7406B" wp14:editId="016F0245">
             <wp:extent cx="4668139" cy="3186430"/>
             <wp:effectExtent l="0" t="0" r="0" b="0"/>
             <wp:docPr id="5922" name="Picture 5922"/>
@@ -32923,7 +33228,7 @@
           <w:noProof/>
         </w:rPr>
         <w:drawing>
-          <wp:inline distT="0" distB="0" distL="0" distR="0">
+          <wp:inline distT="0" distB="0" distL="0" distR="0" wp14:anchorId="1AB6C9CA" wp14:editId="7168111D">
             <wp:extent cx="3759200" cy="3550285"/>
             <wp:effectExtent l="0" t="0" r="0" b="0"/>
             <wp:docPr id="5924" name="Picture 5924"/>
@@ -32985,7 +33290,7 @@
           <w:noProof/>
         </w:rPr>
         <w:drawing>
-          <wp:inline distT="0" distB="0" distL="0" distR="0">
+          <wp:inline distT="0" distB="0" distL="0" distR="0" wp14:anchorId="40657CDC" wp14:editId="1073D4C6">
             <wp:extent cx="3861816" cy="3563620"/>
             <wp:effectExtent l="0" t="0" r="0" b="0"/>
             <wp:docPr id="5947" name="Picture 5947"/>
@@ -33066,7 +33371,7 @@
           <w:noProof/>
         </w:rPr>
         <w:drawing>
-          <wp:inline distT="0" distB="0" distL="0" distR="0">
+          <wp:inline distT="0" distB="0" distL="0" distR="0" wp14:anchorId="46B66308" wp14:editId="5E01FF19">
             <wp:extent cx="5943600" cy="2616200"/>
             <wp:effectExtent l="0" t="0" r="0" b="0"/>
             <wp:docPr id="5949" name="Picture 5949"/>
@@ -33163,7 +33468,7 @@
           <w:noProof/>
         </w:rPr>
         <w:drawing>
-          <wp:inline distT="0" distB="0" distL="0" distR="0">
+          <wp:inline distT="0" distB="0" distL="0" distR="0" wp14:anchorId="0DA45015" wp14:editId="73A0DB9D">
             <wp:extent cx="2942590" cy="2509393"/>
             <wp:effectExtent l="0" t="0" r="0" b="0"/>
             <wp:docPr id="5992" name="Picture 5992"/>
@@ -33224,7 +33529,7 @@
           <w:noProof/>
         </w:rPr>
         <w:drawing>
-          <wp:inline distT="0" distB="0" distL="0" distR="0">
+          <wp:inline distT="0" distB="0" distL="0" distR="0" wp14:anchorId="7D1619C1" wp14:editId="53E70DE7">
             <wp:extent cx="6453378" cy="2355215"/>
             <wp:effectExtent l="0" t="0" r="0" b="0"/>
             <wp:docPr id="5994" name="Picture 5994"/>
@@ -33388,21 +33693,7 @@
           <w:sz w:val="24"/>
         </w:rPr>
         <w:lastRenderedPageBreak/>
-        <w:t xml:space="preserve">Day 5–6: UI/UX wireframes in </w:t>
-      </w:r>
-      <w:proofErr w:type="spellStart"/>
-      <w:r>
-        <w:rPr>
-          <w:sz w:val="24"/>
-        </w:rPr>
-        <w:t>Figma</w:t>
-      </w:r>
-      <w:proofErr w:type="spellEnd"/>
-      <w:r>
-        <w:rPr>
-          <w:sz w:val="24"/>
-        </w:rPr>
-        <w:t xml:space="preserve"> (Tenant, Owner, Admin) Day 7: Final review of design documents </w:t>
+        <w:t xml:space="preserve">Day 5–6: UI/UX wireframes in Figma (Tenant, Owner, Admin) Day 7: Final review of design documents </w:t>
       </w:r>
     </w:p>
     <w:p>
@@ -34075,21 +34366,7 @@
         <w:rPr>
           <w:sz w:val="24"/>
         </w:rPr>
-        <w:t xml:space="preserve"> / </w:t>
-      </w:r>
-      <w:proofErr w:type="spellStart"/>
-      <w:r>
-        <w:rPr>
-          <w:sz w:val="24"/>
-        </w:rPr>
-        <w:t>Netlify</w:t>
-      </w:r>
-      <w:proofErr w:type="spellEnd"/>
-      <w:r>
-        <w:rPr>
-          <w:sz w:val="24"/>
-        </w:rPr>
-        <w:t xml:space="preserve">) </w:t>
+        <w:t xml:space="preserve"> / Netlify) </w:t>
       </w:r>
     </w:p>
     <w:p>
@@ -34470,7 +34747,7 @@
 </file>
 
 <file path=word/endnotes.xml><?xml version="1.0" encoding="utf-8"?>
-<w:endnotes xmlns:wpc="http://schemas.microsoft.com/office/word/2010/wordprocessingCanvas" xmlns:cx="http://schemas.microsoft.com/office/drawing/2014/chartex" xmlns:cx1="http://schemas.microsoft.com/office/drawing/2015/9/8/chartex" xmlns:cx2="http://schemas.microsoft.com/office/drawing/2015/10/21/chartex" xmlns:cx3="http://schemas.microsoft.com/office/drawing/2016/5/9/chartex" xmlns:cx4="http://schemas.microsoft.com/office/drawing/2016/5/10/chartex" xmlns:cx5="http://schemas.microsoft.com/office/drawing/2016/5/11/chartex" xmlns:cx6="http://schemas.microsoft.com/office/drawing/2016/5/12/chartex" xmlns:cx7="http://schemas.microsoft.com/office/drawing/2016/5/13/chartex" xmlns:cx8="http://schemas.microsoft.com/office/drawing/2016/5/14/chartex" xmlns:mc="http://schemas.openxmlformats.org/markup-compatibility/2006" xmlns:aink="http://schemas.microsoft.com/office/drawing/2016/ink" xmlns:am3d="http://schemas.microsoft.com/office/drawing/2017/model3d" xmlns:o="urn:schemas-microsoft-com:office:office" xmlns:r="http://schemas.openxmlformats.org/officeDocument/2006/relationships" xmlns:m="http://schemas.openxmlformats.org/officeDocument/2006/math" xmlns:v="urn:schemas-microsoft-com:vml" xmlns:wp14="http://schemas.microsoft.com/office/word/2010/wordprocessingDrawing" xmlns:wp="http://schemas.openxmlformats.org/drawingml/2006/wordprocessingDrawing" xmlns:w10="urn:schemas-microsoft-com:office:word" xmlns:w="http://schemas.openxmlformats.org/wordprocessingml/2006/main" xmlns:w14="http://schemas.microsoft.com/office/word/2010/wordml" xmlns:w15="http://schemas.microsoft.com/office/word/2012/wordml" xmlns:w16cid="http://schemas.microsoft.com/office/word/2016/wordml/cid" xmlns:w16se="http://schemas.microsoft.com/office/word/2015/wordml/symex" xmlns:wpg="http://schemas.microsoft.com/office/word/2010/wordprocessingGroup" xmlns:wpi="http://schemas.microsoft.com/office/word/2010/wordprocessingInk" xmlns:wne="http://schemas.microsoft.com/office/word/2006/wordml" xmlns:wps="http://schemas.microsoft.com/office/word/2010/wordprocessingShape" mc:Ignorable="w14 w15 w16se w16cid wp14">
+<w:endnotes xmlns:wpc="http://schemas.microsoft.com/office/word/2010/wordprocessingCanvas" xmlns:cx="http://schemas.microsoft.com/office/drawing/2014/chartex" xmlns:cx1="http://schemas.microsoft.com/office/drawing/2015/9/8/chartex" xmlns:cx2="http://schemas.microsoft.com/office/drawing/2015/10/21/chartex" xmlns:cx3="http://schemas.microsoft.com/office/drawing/2016/5/9/chartex" xmlns:cx4="http://schemas.microsoft.com/office/drawing/2016/5/10/chartex" xmlns:cx5="http://schemas.microsoft.com/office/drawing/2016/5/11/chartex" xmlns:cx6="http://schemas.microsoft.com/office/drawing/2016/5/12/chartex" xmlns:cx7="http://schemas.microsoft.com/office/drawing/2016/5/13/chartex" xmlns:cx8="http://schemas.microsoft.com/office/drawing/2016/5/14/chartex" xmlns:mc="http://schemas.openxmlformats.org/markup-compatibility/2006" xmlns:aink="http://schemas.microsoft.com/office/drawing/2016/ink" xmlns:am3d="http://schemas.microsoft.com/office/drawing/2017/model3d" xmlns:o="urn:schemas-microsoft-com:office:office" xmlns:oel="http://schemas.microsoft.com/office/2019/extlst" xmlns:r="http://schemas.openxmlformats.org/officeDocument/2006/relationships" xmlns:m="http://schemas.openxmlformats.org/officeDocument/2006/math" xmlns:v="urn:schemas-microsoft-com:vml" xmlns:wp14="http://schemas.microsoft.com/office/word/2010/wordprocessingDrawing" xmlns:wp="http://schemas.openxmlformats.org/drawingml/2006/wordprocessingDrawing" xmlns:w10="urn:schemas-microsoft-com:office:word" xmlns:w="http://schemas.openxmlformats.org/wordprocessingml/2006/main" xmlns:w14="http://schemas.microsoft.com/office/word/2010/wordml" xmlns:w15="http://schemas.microsoft.com/office/word/2012/wordml" xmlns:w16cex="http://schemas.microsoft.com/office/word/2018/wordml/cex" xmlns:w16cid="http://schemas.microsoft.com/office/word/2016/wordml/cid" xmlns:w16="http://schemas.microsoft.com/office/word/2018/wordml" xmlns:w16du="http://schemas.microsoft.com/office/word/2023/wordml/word16du" xmlns:w16sdtdh="http://schemas.microsoft.com/office/word/2020/wordml/sdtdatahash" xmlns:w16sdtfl="http://schemas.microsoft.com/office/word/2024/wordml/sdtformatlock" xmlns:w16se="http://schemas.microsoft.com/office/word/2015/wordml/symex" xmlns:wpg="http://schemas.microsoft.com/office/word/2010/wordprocessingGroup" xmlns:wpi="http://schemas.microsoft.com/office/word/2010/wordprocessingInk" xmlns:wne="http://schemas.microsoft.com/office/word/2006/wordml" xmlns:wps="http://schemas.microsoft.com/office/word/2010/wordprocessingShape" mc:Ignorable="w14 w15 w16se w16cid w16 w16cex w16sdtdh w16sdtfl w16du wp14">
   <w:endnote w:type="separator" w:id="-1">
     <w:p>
       <w:pPr>
@@ -34495,7 +34772,7 @@
 </file>
 
 <file path=word/footer1.xml><?xml version="1.0" encoding="utf-8"?>
-<w:ftr xmlns:wpc="http://schemas.microsoft.com/office/word/2010/wordprocessingCanvas" xmlns:cx="http://schemas.microsoft.com/office/drawing/2014/chartex" xmlns:cx1="http://schemas.microsoft.com/office/drawing/2015/9/8/chartex" xmlns:cx2="http://schemas.microsoft.com/office/drawing/2015/10/21/chartex" xmlns:cx3="http://schemas.microsoft.com/office/drawing/2016/5/9/chartex" xmlns:cx4="http://schemas.microsoft.com/office/drawing/2016/5/10/chartex" xmlns:cx5="http://schemas.microsoft.com/office/drawing/2016/5/11/chartex" xmlns:cx6="http://schemas.microsoft.com/office/drawing/2016/5/12/chartex" xmlns:cx7="http://schemas.microsoft.com/office/drawing/2016/5/13/chartex" xmlns:cx8="http://schemas.microsoft.com/office/drawing/2016/5/14/chartex" xmlns:mc="http://schemas.openxmlformats.org/markup-compatibility/2006" xmlns:aink="http://schemas.microsoft.com/office/drawing/2016/ink" xmlns:am3d="http://schemas.microsoft.com/office/drawing/2017/model3d" xmlns:o="urn:schemas-microsoft-com:office:office" xmlns:r="http://schemas.openxmlformats.org/officeDocument/2006/relationships" xmlns:m="http://schemas.openxmlformats.org/officeDocument/2006/math" xmlns:v="urn:schemas-microsoft-com:vml" xmlns:wp14="http://schemas.microsoft.com/office/word/2010/wordprocessingDrawing" xmlns:wp="http://schemas.openxmlformats.org/drawingml/2006/wordprocessingDrawing" xmlns:w10="urn:schemas-microsoft-com:office:word" xmlns:w="http://schemas.openxmlformats.org/wordprocessingml/2006/main" xmlns:w14="http://schemas.microsoft.com/office/word/2010/wordml" xmlns:w15="http://schemas.microsoft.com/office/word/2012/wordml" xmlns:w16cid="http://schemas.microsoft.com/office/word/2016/wordml/cid" xmlns:w16se="http://schemas.microsoft.com/office/word/2015/wordml/symex" xmlns:wpg="http://schemas.microsoft.com/office/word/2010/wordprocessingGroup" xmlns:wpi="http://schemas.microsoft.com/office/word/2010/wordprocessingInk" xmlns:wne="http://schemas.microsoft.com/office/word/2006/wordml" xmlns:wps="http://schemas.microsoft.com/office/word/2010/wordprocessingShape" mc:Ignorable="w14 w15 w16se w16cid wp14">
+<w:ftr xmlns:wpc="http://schemas.microsoft.com/office/word/2010/wordprocessingCanvas" xmlns:cx="http://schemas.microsoft.com/office/drawing/2014/chartex" xmlns:cx1="http://schemas.microsoft.com/office/drawing/2015/9/8/chartex" xmlns:cx2="http://schemas.microsoft.com/office/drawing/2015/10/21/chartex" xmlns:cx3="http://schemas.microsoft.com/office/drawing/2016/5/9/chartex" xmlns:cx4="http://schemas.microsoft.com/office/drawing/2016/5/10/chartex" xmlns:cx5="http://schemas.microsoft.com/office/drawing/2016/5/11/chartex" xmlns:cx6="http://schemas.microsoft.com/office/drawing/2016/5/12/chartex" xmlns:cx7="http://schemas.microsoft.com/office/drawing/2016/5/13/chartex" xmlns:cx8="http://schemas.microsoft.com/office/drawing/2016/5/14/chartex" xmlns:mc="http://schemas.openxmlformats.org/markup-compatibility/2006" xmlns:aink="http://schemas.microsoft.com/office/drawing/2016/ink" xmlns:am3d="http://schemas.microsoft.com/office/drawing/2017/model3d" xmlns:o="urn:schemas-microsoft-com:office:office" xmlns:oel="http://schemas.microsoft.com/office/2019/extlst" xmlns:r="http://schemas.openxmlformats.org/officeDocument/2006/relationships" xmlns:m="http://schemas.openxmlformats.org/officeDocument/2006/math" xmlns:v="urn:schemas-microsoft-com:vml" xmlns:wp14="http://schemas.microsoft.com/office/word/2010/wordprocessingDrawing" xmlns:wp="http://schemas.openxmlformats.org/drawingml/2006/wordprocessingDrawing" xmlns:w10="urn:schemas-microsoft-com:office:word" xmlns:w="http://schemas.openxmlformats.org/wordprocessingml/2006/main" xmlns:w14="http://schemas.microsoft.com/office/word/2010/wordml" xmlns:w15="http://schemas.microsoft.com/office/word/2012/wordml" xmlns:w16cex="http://schemas.microsoft.com/office/word/2018/wordml/cex" xmlns:w16cid="http://schemas.microsoft.com/office/word/2016/wordml/cid" xmlns:w16="http://schemas.microsoft.com/office/word/2018/wordml" xmlns:w16du="http://schemas.microsoft.com/office/word/2023/wordml/word16du" xmlns:w16sdtdh="http://schemas.microsoft.com/office/word/2020/wordml/sdtdatahash" xmlns:w16sdtfl="http://schemas.microsoft.com/office/word/2024/wordml/sdtformatlock" xmlns:w16se="http://schemas.microsoft.com/office/word/2015/wordml/symex" xmlns:wpg="http://schemas.microsoft.com/office/word/2010/wordprocessingGroup" xmlns:wpi="http://schemas.microsoft.com/office/word/2010/wordprocessingInk" xmlns:wne="http://schemas.microsoft.com/office/word/2006/wordml" xmlns:wps="http://schemas.microsoft.com/office/word/2010/wordprocessingShape" mc:Ignorable="w14 w15 w16se w16cid w16 w16cex w16sdtdh w16sdtfl w16du wp14">
   <w:p>
     <w:pPr>
       <w:spacing w:after="0"/>
@@ -34545,7 +34822,7 @@
 </file>
 
 <file path=word/footer2.xml><?xml version="1.0" encoding="utf-8"?>
-<w:ftr xmlns:wpc="http://schemas.microsoft.com/office/word/2010/wordprocessingCanvas" xmlns:cx="http://schemas.microsoft.com/office/drawing/2014/chartex" xmlns:cx1="http://schemas.microsoft.com/office/drawing/2015/9/8/chartex" xmlns:cx2="http://schemas.microsoft.com/office/drawing/2015/10/21/chartex" xmlns:cx3="http://schemas.microsoft.com/office/drawing/2016/5/9/chartex" xmlns:cx4="http://schemas.microsoft.com/office/drawing/2016/5/10/chartex" xmlns:cx5="http://schemas.microsoft.com/office/drawing/2016/5/11/chartex" xmlns:cx6="http://schemas.microsoft.com/office/drawing/2016/5/12/chartex" xmlns:cx7="http://schemas.microsoft.com/office/drawing/2016/5/13/chartex" xmlns:cx8="http://schemas.microsoft.com/office/drawing/2016/5/14/chartex" xmlns:mc="http://schemas.openxmlformats.org/markup-compatibility/2006" xmlns:aink="http://schemas.microsoft.com/office/drawing/2016/ink" xmlns:am3d="http://schemas.microsoft.com/office/drawing/2017/model3d" xmlns:o="urn:schemas-microsoft-com:office:office" xmlns:r="http://schemas.openxmlformats.org/officeDocument/2006/relationships" xmlns:m="http://schemas.openxmlformats.org/officeDocument/2006/math" xmlns:v="urn:schemas-microsoft-com:vml" xmlns:wp14="http://schemas.microsoft.com/office/word/2010/wordprocessingDrawing" xmlns:wp="http://schemas.openxmlformats.org/drawingml/2006/wordprocessingDrawing" xmlns:w10="urn:schemas-microsoft-com:office:word" xmlns:w="http://schemas.openxmlformats.org/wordprocessingml/2006/main" xmlns:w14="http://schemas.microsoft.com/office/word/2010/wordml" xmlns:w15="http://schemas.microsoft.com/office/word/2012/wordml" xmlns:w16cid="http://schemas.microsoft.com/office/word/2016/wordml/cid" xmlns:w16se="http://schemas.microsoft.com/office/word/2015/wordml/symex" xmlns:wpg="http://schemas.microsoft.com/office/word/2010/wordprocessingGroup" xmlns:wpi="http://schemas.microsoft.com/office/word/2010/wordprocessingInk" xmlns:wne="http://schemas.microsoft.com/office/word/2006/wordml" xmlns:wps="http://schemas.microsoft.com/office/word/2010/wordprocessingShape" mc:Ignorable="w14 w15 w16se w16cid wp14">
+<w:ftr xmlns:wpc="http://schemas.microsoft.com/office/word/2010/wordprocessingCanvas" xmlns:cx="http://schemas.microsoft.com/office/drawing/2014/chartex" xmlns:cx1="http://schemas.microsoft.com/office/drawing/2015/9/8/chartex" xmlns:cx2="http://schemas.microsoft.com/office/drawing/2015/10/21/chartex" xmlns:cx3="http://schemas.microsoft.com/office/drawing/2016/5/9/chartex" xmlns:cx4="http://schemas.microsoft.com/office/drawing/2016/5/10/chartex" xmlns:cx5="http://schemas.microsoft.com/office/drawing/2016/5/11/chartex" xmlns:cx6="http://schemas.microsoft.com/office/drawing/2016/5/12/chartex" xmlns:cx7="http://schemas.microsoft.com/office/drawing/2016/5/13/chartex" xmlns:cx8="http://schemas.microsoft.com/office/drawing/2016/5/14/chartex" xmlns:mc="http://schemas.openxmlformats.org/markup-compatibility/2006" xmlns:aink="http://schemas.microsoft.com/office/drawing/2016/ink" xmlns:am3d="http://schemas.microsoft.com/office/drawing/2017/model3d" xmlns:o="urn:schemas-microsoft-com:office:office" xmlns:oel="http://schemas.microsoft.com/office/2019/extlst" xmlns:r="http://schemas.openxmlformats.org/officeDocument/2006/relationships" xmlns:m="http://schemas.openxmlformats.org/officeDocument/2006/math" xmlns:v="urn:schemas-microsoft-com:vml" xmlns:wp14="http://schemas.microsoft.com/office/word/2010/wordprocessingDrawing" xmlns:wp="http://schemas.openxmlformats.org/drawingml/2006/wordprocessingDrawing" xmlns:w10="urn:schemas-microsoft-com:office:word" xmlns:w="http://schemas.openxmlformats.org/wordprocessingml/2006/main" xmlns:w14="http://schemas.microsoft.com/office/word/2010/wordml" xmlns:w15="http://schemas.microsoft.com/office/word/2012/wordml" xmlns:w16cex="http://schemas.microsoft.com/office/word/2018/wordml/cex" xmlns:w16cid="http://schemas.microsoft.com/office/word/2016/wordml/cid" xmlns:w16="http://schemas.microsoft.com/office/word/2018/wordml" xmlns:w16du="http://schemas.microsoft.com/office/word/2023/wordml/word16du" xmlns:w16sdtdh="http://schemas.microsoft.com/office/word/2020/wordml/sdtdatahash" xmlns:w16sdtfl="http://schemas.microsoft.com/office/word/2024/wordml/sdtformatlock" xmlns:w16se="http://schemas.microsoft.com/office/word/2015/wordml/symex" xmlns:wpg="http://schemas.microsoft.com/office/word/2010/wordprocessingGroup" xmlns:wpi="http://schemas.microsoft.com/office/word/2010/wordprocessingInk" xmlns:wne="http://schemas.microsoft.com/office/word/2006/wordml" xmlns:wps="http://schemas.microsoft.com/office/word/2010/wordprocessingShape" mc:Ignorable="w14 w15 w16se w16cid w16 w16cex w16sdtdh w16sdtfl w16du wp14">
   <w:p>
     <w:pPr>
       <w:spacing w:after="0"/>
@@ -34595,7 +34872,7 @@
 </file>
 
 <file path=word/footer3.xml><?xml version="1.0" encoding="utf-8"?>
-<w:ftr xmlns:wpc="http://schemas.microsoft.com/office/word/2010/wordprocessingCanvas" xmlns:cx="http://schemas.microsoft.com/office/drawing/2014/chartex" xmlns:cx1="http://schemas.microsoft.com/office/drawing/2015/9/8/chartex" xmlns:cx2="http://schemas.microsoft.com/office/drawing/2015/10/21/chartex" xmlns:cx3="http://schemas.microsoft.com/office/drawing/2016/5/9/chartex" xmlns:cx4="http://schemas.microsoft.com/office/drawing/2016/5/10/chartex" xmlns:cx5="http://schemas.microsoft.com/office/drawing/2016/5/11/chartex" xmlns:cx6="http://schemas.microsoft.com/office/drawing/2016/5/12/chartex" xmlns:cx7="http://schemas.microsoft.com/office/drawing/2016/5/13/chartex" xmlns:cx8="http://schemas.microsoft.com/office/drawing/2016/5/14/chartex" xmlns:mc="http://schemas.openxmlformats.org/markup-compatibility/2006" xmlns:aink="http://schemas.microsoft.com/office/drawing/2016/ink" xmlns:am3d="http://schemas.microsoft.com/office/drawing/2017/model3d" xmlns:o="urn:schemas-microsoft-com:office:office" xmlns:r="http://schemas.openxmlformats.org/officeDocument/2006/relationships" xmlns:m="http://schemas.openxmlformats.org/officeDocument/2006/math" xmlns:v="urn:schemas-microsoft-com:vml" xmlns:wp14="http://schemas.microsoft.com/office/word/2010/wordprocessingDrawing" xmlns:wp="http://schemas.openxmlformats.org/drawingml/2006/wordprocessingDrawing" xmlns:w10="urn:schemas-microsoft-com:office:word" xmlns:w="http://schemas.openxmlformats.org/wordprocessingml/2006/main" xmlns:w14="http://schemas.microsoft.com/office/word/2010/wordml" xmlns:w15="http://schemas.microsoft.com/office/word/2012/wordml" xmlns:w16cid="http://schemas.microsoft.com/office/word/2016/wordml/cid" xmlns:w16se="http://schemas.microsoft.com/office/word/2015/wordml/symex" xmlns:wpg="http://schemas.microsoft.com/office/word/2010/wordprocessingGroup" xmlns:wpi="http://schemas.microsoft.com/office/word/2010/wordprocessingInk" xmlns:wne="http://schemas.microsoft.com/office/word/2006/wordml" xmlns:wps="http://schemas.microsoft.com/office/word/2010/wordprocessingShape" mc:Ignorable="w14 w15 w16se w16cid wp14">
+<w:ftr xmlns:wpc="http://schemas.microsoft.com/office/word/2010/wordprocessingCanvas" xmlns:cx="http://schemas.microsoft.com/office/drawing/2014/chartex" xmlns:cx1="http://schemas.microsoft.com/office/drawing/2015/9/8/chartex" xmlns:cx2="http://schemas.microsoft.com/office/drawing/2015/10/21/chartex" xmlns:cx3="http://schemas.microsoft.com/office/drawing/2016/5/9/chartex" xmlns:cx4="http://schemas.microsoft.com/office/drawing/2016/5/10/chartex" xmlns:cx5="http://schemas.microsoft.com/office/drawing/2016/5/11/chartex" xmlns:cx6="http://schemas.microsoft.com/office/drawing/2016/5/12/chartex" xmlns:cx7="http://schemas.microsoft.com/office/drawing/2016/5/13/chartex" xmlns:cx8="http://schemas.microsoft.com/office/drawing/2016/5/14/chartex" xmlns:mc="http://schemas.openxmlformats.org/markup-compatibility/2006" xmlns:aink="http://schemas.microsoft.com/office/drawing/2016/ink" xmlns:am3d="http://schemas.microsoft.com/office/drawing/2017/model3d" xmlns:o="urn:schemas-microsoft-com:office:office" xmlns:oel="http://schemas.microsoft.com/office/2019/extlst" xmlns:r="http://schemas.openxmlformats.org/officeDocument/2006/relationships" xmlns:m="http://schemas.openxmlformats.org/officeDocument/2006/math" xmlns:v="urn:schemas-microsoft-com:vml" xmlns:wp14="http://schemas.microsoft.com/office/word/2010/wordprocessingDrawing" xmlns:wp="http://schemas.openxmlformats.org/drawingml/2006/wordprocessingDrawing" xmlns:w10="urn:schemas-microsoft-com:office:word" xmlns:w="http://schemas.openxmlformats.org/wordprocessingml/2006/main" xmlns:w14="http://schemas.microsoft.com/office/word/2010/wordml" xmlns:w15="http://schemas.microsoft.com/office/word/2012/wordml" xmlns:w16cex="http://schemas.microsoft.com/office/word/2018/wordml/cex" xmlns:w16cid="http://schemas.microsoft.com/office/word/2016/wordml/cid" xmlns:w16="http://schemas.microsoft.com/office/word/2018/wordml" xmlns:w16du="http://schemas.microsoft.com/office/word/2023/wordml/word16du" xmlns:w16sdtdh="http://schemas.microsoft.com/office/word/2020/wordml/sdtdatahash" xmlns:w16sdtfl="http://schemas.microsoft.com/office/word/2024/wordml/sdtformatlock" xmlns:w16se="http://schemas.microsoft.com/office/word/2015/wordml/symex" xmlns:wpg="http://schemas.microsoft.com/office/word/2010/wordprocessingGroup" xmlns:wpi="http://schemas.microsoft.com/office/word/2010/wordprocessingInk" xmlns:wne="http://schemas.microsoft.com/office/word/2006/wordml" xmlns:wps="http://schemas.microsoft.com/office/word/2010/wordprocessingShape" mc:Ignorable="w14 w15 w16se w16cid w16 w16cex w16sdtdh w16sdtfl w16du wp14">
   <w:p>
     <w:pPr>
       <w:spacing w:after="0"/>
@@ -34645,7 +34922,7 @@
 </file>
 
 <file path=word/footnotes.xml><?xml version="1.0" encoding="utf-8"?>
-<w:footnotes xmlns:wpc="http://schemas.microsoft.com/office/word/2010/wordprocessingCanvas" xmlns:cx="http://schemas.microsoft.com/office/drawing/2014/chartex" xmlns:cx1="http://schemas.microsoft.com/office/drawing/2015/9/8/chartex" xmlns:cx2="http://schemas.microsoft.com/office/drawing/2015/10/21/chartex" xmlns:cx3="http://schemas.microsoft.com/office/drawing/2016/5/9/chartex" xmlns:cx4="http://schemas.microsoft.com/office/drawing/2016/5/10/chartex" xmlns:cx5="http://schemas.microsoft.com/office/drawing/2016/5/11/chartex" xmlns:cx6="http://schemas.microsoft.com/office/drawing/2016/5/12/chartex" xmlns:cx7="http://schemas.microsoft.com/office/drawing/2016/5/13/chartex" xmlns:cx8="http://schemas.microsoft.com/office/drawing/2016/5/14/chartex" xmlns:mc="http://schemas.openxmlformats.org/markup-compatibility/2006" xmlns:aink="http://schemas.microsoft.com/office/drawing/2016/ink" xmlns:am3d="http://schemas.microsoft.com/office/drawing/2017/model3d" xmlns:o="urn:schemas-microsoft-com:office:office" xmlns:r="http://schemas.openxmlformats.org/officeDocument/2006/relationships" xmlns:m="http://schemas.openxmlformats.org/officeDocument/2006/math" xmlns:v="urn:schemas-microsoft-com:vml" xmlns:wp14="http://schemas.microsoft.com/office/word/2010/wordprocessingDrawing" xmlns:wp="http://schemas.openxmlformats.org/drawingml/2006/wordprocessingDrawing" xmlns:w10="urn:schemas-microsoft-com:office:word" xmlns:w="http://schemas.openxmlformats.org/wordprocessingml/2006/main" xmlns:w14="http://schemas.microsoft.com/office/word/2010/wordml" xmlns:w15="http://schemas.microsoft.com/office/word/2012/wordml" xmlns:w16cid="http://schemas.microsoft.com/office/word/2016/wordml/cid" xmlns:w16se="http://schemas.microsoft.com/office/word/2015/wordml/symex" xmlns:wpg="http://schemas.microsoft.com/office/word/2010/wordprocessingGroup" xmlns:wpi="http://schemas.microsoft.com/office/word/2010/wordprocessingInk" xmlns:wne="http://schemas.microsoft.com/office/word/2006/wordml" xmlns:wps="http://schemas.microsoft.com/office/word/2010/wordprocessingShape" mc:Ignorable="w14 w15 w16se w16cid wp14">
+<w:footnotes xmlns:wpc="http://schemas.microsoft.com/office/word/2010/wordprocessingCanvas" xmlns:cx="http://schemas.microsoft.com/office/drawing/2014/chartex" xmlns:cx1="http://schemas.microsoft.com/office/drawing/2015/9/8/chartex" xmlns:cx2="http://schemas.microsoft.com/office/drawing/2015/10/21/chartex" xmlns:cx3="http://schemas.microsoft.com/office/drawing/2016/5/9/chartex" xmlns:cx4="http://schemas.microsoft.com/office/drawing/2016/5/10/chartex" xmlns:cx5="http://schemas.microsoft.com/office/drawing/2016/5/11/chartex" xmlns:cx6="http://schemas.microsoft.com/office/drawing/2016/5/12/chartex" xmlns:cx7="http://schemas.microsoft.com/office/drawing/2016/5/13/chartex" xmlns:cx8="http://schemas.microsoft.com/office/drawing/2016/5/14/chartex" xmlns:mc="http://schemas.openxmlformats.org/markup-compatibility/2006" xmlns:aink="http://schemas.microsoft.com/office/drawing/2016/ink" xmlns:am3d="http://schemas.microsoft.com/office/drawing/2017/model3d" xmlns:o="urn:schemas-microsoft-com:office:office" xmlns:oel="http://schemas.microsoft.com/office/2019/extlst" xmlns:r="http://schemas.openxmlformats.org/officeDocument/2006/relationships" xmlns:m="http://schemas.openxmlformats.org/officeDocument/2006/math" xmlns:v="urn:schemas-microsoft-com:vml" xmlns:wp14="http://schemas.microsoft.com/office/word/2010/wordprocessingDrawing" xmlns:wp="http://schemas.openxmlformats.org/drawingml/2006/wordprocessingDrawing" xmlns:w10="urn:schemas-microsoft-com:office:word" xmlns:w="http://schemas.openxmlformats.org/wordprocessingml/2006/main" xmlns:w14="http://schemas.microsoft.com/office/word/2010/wordml" xmlns:w15="http://schemas.microsoft.com/office/word/2012/wordml" xmlns:w16cex="http://schemas.microsoft.com/office/word/2018/wordml/cex" xmlns:w16cid="http://schemas.microsoft.com/office/word/2016/wordml/cid" xmlns:w16="http://schemas.microsoft.com/office/word/2018/wordml" xmlns:w16du="http://schemas.microsoft.com/office/word/2023/wordml/word16du" xmlns:w16sdtdh="http://schemas.microsoft.com/office/word/2020/wordml/sdtdatahash" xmlns:w16sdtfl="http://schemas.microsoft.com/office/word/2024/wordml/sdtformatlock" xmlns:w16se="http://schemas.microsoft.com/office/word/2015/wordml/symex" xmlns:wpg="http://schemas.microsoft.com/office/word/2010/wordprocessingGroup" xmlns:wpi="http://schemas.microsoft.com/office/word/2010/wordprocessingInk" xmlns:wne="http://schemas.microsoft.com/office/word/2006/wordml" xmlns:wps="http://schemas.microsoft.com/office/word/2010/wordprocessingShape" mc:Ignorable="w14 w15 w16se w16cid w16 w16cex w16sdtdh w16sdtfl w16du wp14">
   <w:footnote w:type="separator" w:id="-1">
     <w:p>
       <w:pPr>
@@ -34670,7 +34947,7 @@
 </file>
 
 <file path=word/numbering.xml><?xml version="1.0" encoding="utf-8"?>
-<w:numbering xmlns:wpc="http://schemas.microsoft.com/office/word/2010/wordprocessingCanvas" xmlns:cx="http://schemas.microsoft.com/office/drawing/2014/chartex" xmlns:cx1="http://schemas.microsoft.com/office/drawing/2015/9/8/chartex" xmlns:cx2="http://schemas.microsoft.com/office/drawing/2015/10/21/chartex" xmlns:cx3="http://schemas.microsoft.com/office/drawing/2016/5/9/chartex" xmlns:cx4="http://schemas.microsoft.com/office/drawing/2016/5/10/chartex" xmlns:cx5="http://schemas.microsoft.com/office/drawing/2016/5/11/chartex" xmlns:cx6="http://schemas.microsoft.com/office/drawing/2016/5/12/chartex" xmlns:cx7="http://schemas.microsoft.com/office/drawing/2016/5/13/chartex" xmlns:cx8="http://schemas.microsoft.com/office/drawing/2016/5/14/chartex" xmlns:mc="http://schemas.openxmlformats.org/markup-compatibility/2006" xmlns:aink="http://schemas.microsoft.com/office/drawing/2016/ink" xmlns:am3d="http://schemas.microsoft.com/office/drawing/2017/model3d" xmlns:o="urn:schemas-microsoft-com:office:office" xmlns:r="http://schemas.openxmlformats.org/officeDocument/2006/relationships" xmlns:m="http://schemas.openxmlformats.org/officeDocument/2006/math" xmlns:v="urn:schemas-microsoft-com:vml" xmlns:wp14="http://schemas.microsoft.com/office/word/2010/wordprocessingDrawing" xmlns:wp="http://schemas.openxmlformats.org/drawingml/2006/wordprocessingDrawing" xmlns:w10="urn:schemas-microsoft-com:office:word" xmlns:w="http://schemas.openxmlformats.org/wordprocessingml/2006/main" xmlns:w14="http://schemas.microsoft.com/office/word/2010/wordml" xmlns:w15="http://schemas.microsoft.com/office/word/2012/wordml" xmlns:w16cid="http://schemas.microsoft.com/office/word/2016/wordml/cid" xmlns:w16se="http://schemas.microsoft.com/office/word/2015/wordml/symex" xmlns:wpg="http://schemas.microsoft.com/office/word/2010/wordprocessingGroup" xmlns:wpi="http://schemas.microsoft.com/office/word/2010/wordprocessingInk" xmlns:wne="http://schemas.microsoft.com/office/word/2006/wordml" xmlns:wps="http://schemas.microsoft.com/office/word/2010/wordprocessingShape" mc:Ignorable="w14 w15 w16se w16cid wp14">
+<w:numbering xmlns:wpc="http://schemas.microsoft.com/office/word/2010/wordprocessingCanvas" xmlns:cx="http://schemas.microsoft.com/office/drawing/2014/chartex" xmlns:cx1="http://schemas.microsoft.com/office/drawing/2015/9/8/chartex" xmlns:cx2="http://schemas.microsoft.com/office/drawing/2015/10/21/chartex" xmlns:cx3="http://schemas.microsoft.com/office/drawing/2016/5/9/chartex" xmlns:cx4="http://schemas.microsoft.com/office/drawing/2016/5/10/chartex" xmlns:cx5="http://schemas.microsoft.com/office/drawing/2016/5/11/chartex" xmlns:cx6="http://schemas.microsoft.com/office/drawing/2016/5/12/chartex" xmlns:cx7="http://schemas.microsoft.com/office/drawing/2016/5/13/chartex" xmlns:cx8="http://schemas.microsoft.com/office/drawing/2016/5/14/chartex" xmlns:mc="http://schemas.openxmlformats.org/markup-compatibility/2006" xmlns:aink="http://schemas.microsoft.com/office/drawing/2016/ink" xmlns:am3d="http://schemas.microsoft.com/office/drawing/2017/model3d" xmlns:o="urn:schemas-microsoft-com:office:office" xmlns:oel="http://schemas.microsoft.com/office/2019/extlst" xmlns:r="http://schemas.openxmlformats.org/officeDocument/2006/relationships" xmlns:m="http://schemas.openxmlformats.org/officeDocument/2006/math" xmlns:v="urn:schemas-microsoft-com:vml" xmlns:wp14="http://schemas.microsoft.com/office/word/2010/wordprocessingDrawing" xmlns:wp="http://schemas.openxmlformats.org/drawingml/2006/wordprocessingDrawing" xmlns:w10="urn:schemas-microsoft-com:office:word" xmlns:w="http://schemas.openxmlformats.org/wordprocessingml/2006/main" xmlns:w14="http://schemas.microsoft.com/office/word/2010/wordml" xmlns:w15="http://schemas.microsoft.com/office/word/2012/wordml" xmlns:w16cex="http://schemas.microsoft.com/office/word/2018/wordml/cex" xmlns:w16cid="http://schemas.microsoft.com/office/word/2016/wordml/cid" xmlns:w16="http://schemas.microsoft.com/office/word/2018/wordml" xmlns:w16du="http://schemas.microsoft.com/office/word/2023/wordml/word16du" xmlns:w16sdtdh="http://schemas.microsoft.com/office/word/2020/wordml/sdtdatahash" xmlns:w16sdtfl="http://schemas.microsoft.com/office/word/2024/wordml/sdtformatlock" xmlns:w16se="http://schemas.microsoft.com/office/word/2015/wordml/symex" xmlns:wpg="http://schemas.microsoft.com/office/word/2010/wordprocessingGroup" xmlns:wpi="http://schemas.microsoft.com/office/word/2010/wordprocessingInk" xmlns:wne="http://schemas.microsoft.com/office/word/2006/wordml" xmlns:wps="http://schemas.microsoft.com/office/word/2010/wordprocessingShape" mc:Ignorable="w14 w15 w16se w16cid w16 w16cex w16sdtdh w16sdtfl w16du wp14">
   <w:abstractNum w:abstractNumId="0" w15:restartNumberingAfterBreak="0">
     <w:nsid w:val="04212210"/>
     <w:multiLevelType w:val="hybridMultilevel"/>
@@ -40829,98 +41106,98 @@
       </w:rPr>
     </w:lvl>
   </w:abstractNum>
-  <w:num w:numId="1">
+  <w:num w:numId="1" w16cid:durableId="525948453">
     <w:abstractNumId w:val="9"/>
   </w:num>
-  <w:num w:numId="2">
+  <w:num w:numId="2" w16cid:durableId="2143695292">
     <w:abstractNumId w:val="22"/>
   </w:num>
-  <w:num w:numId="3">
+  <w:num w:numId="3" w16cid:durableId="1589384489">
     <w:abstractNumId w:val="23"/>
   </w:num>
-  <w:num w:numId="4">
+  <w:num w:numId="4" w16cid:durableId="394008725">
     <w:abstractNumId w:val="4"/>
   </w:num>
-  <w:num w:numId="5">
+  <w:num w:numId="5" w16cid:durableId="421148382">
     <w:abstractNumId w:val="2"/>
   </w:num>
-  <w:num w:numId="6">
+  <w:num w:numId="6" w16cid:durableId="950550819">
     <w:abstractNumId w:val="25"/>
   </w:num>
-  <w:num w:numId="7">
+  <w:num w:numId="7" w16cid:durableId="1895457860">
     <w:abstractNumId w:val="14"/>
   </w:num>
-  <w:num w:numId="8">
+  <w:num w:numId="8" w16cid:durableId="1708792325">
     <w:abstractNumId w:val="26"/>
   </w:num>
-  <w:num w:numId="9">
+  <w:num w:numId="9" w16cid:durableId="1837068525">
     <w:abstractNumId w:val="20"/>
   </w:num>
-  <w:num w:numId="10">
+  <w:num w:numId="10" w16cid:durableId="1456950752">
     <w:abstractNumId w:val="27"/>
   </w:num>
-  <w:num w:numId="11">
+  <w:num w:numId="11" w16cid:durableId="716666052">
     <w:abstractNumId w:val="21"/>
   </w:num>
-  <w:num w:numId="12">
+  <w:num w:numId="12" w16cid:durableId="158741622">
     <w:abstractNumId w:val="0"/>
   </w:num>
-  <w:num w:numId="13">
+  <w:num w:numId="13" w16cid:durableId="1465391452">
     <w:abstractNumId w:val="12"/>
   </w:num>
-  <w:num w:numId="14">
+  <w:num w:numId="14" w16cid:durableId="655642992">
     <w:abstractNumId w:val="5"/>
   </w:num>
-  <w:num w:numId="15">
+  <w:num w:numId="15" w16cid:durableId="666397652">
     <w:abstractNumId w:val="24"/>
   </w:num>
-  <w:num w:numId="16">
+  <w:num w:numId="16" w16cid:durableId="787823570">
     <w:abstractNumId w:val="3"/>
   </w:num>
-  <w:num w:numId="17">
+  <w:num w:numId="17" w16cid:durableId="2063795042">
     <w:abstractNumId w:val="18"/>
   </w:num>
-  <w:num w:numId="18">
+  <w:num w:numId="18" w16cid:durableId="487327176">
     <w:abstractNumId w:val="11"/>
   </w:num>
-  <w:num w:numId="19">
+  <w:num w:numId="19" w16cid:durableId="426198698">
     <w:abstractNumId w:val="10"/>
   </w:num>
-  <w:num w:numId="20">
+  <w:num w:numId="20" w16cid:durableId="845748991">
     <w:abstractNumId w:val="13"/>
   </w:num>
-  <w:num w:numId="21">
+  <w:num w:numId="21" w16cid:durableId="2094738109">
     <w:abstractNumId w:val="16"/>
   </w:num>
-  <w:num w:numId="22">
+  <w:num w:numId="22" w16cid:durableId="1725980704">
     <w:abstractNumId w:val="7"/>
   </w:num>
-  <w:num w:numId="23">
+  <w:num w:numId="23" w16cid:durableId="1496266196">
     <w:abstractNumId w:val="17"/>
   </w:num>
-  <w:num w:numId="24">
+  <w:num w:numId="24" w16cid:durableId="291596851">
     <w:abstractNumId w:val="1"/>
   </w:num>
-  <w:num w:numId="25">
+  <w:num w:numId="25" w16cid:durableId="734594862">
     <w:abstractNumId w:val="15"/>
   </w:num>
-  <w:num w:numId="26">
+  <w:num w:numId="26" w16cid:durableId="972246057">
     <w:abstractNumId w:val="28"/>
   </w:num>
-  <w:num w:numId="27">
+  <w:num w:numId="27" w16cid:durableId="1079517667">
     <w:abstractNumId w:val="8"/>
   </w:num>
-  <w:num w:numId="28">
+  <w:num w:numId="28" w16cid:durableId="1918712147">
     <w:abstractNumId w:val="19"/>
   </w:num>
-  <w:num w:numId="29">
+  <w:num w:numId="29" w16cid:durableId="1282414988">
     <w:abstractNumId w:val="6"/>
   </w:num>
 </w:numbering>
 </file>
 
 <file path=word/styles.xml><?xml version="1.0" encoding="utf-8"?>
-<w:styles xmlns:mc="http://schemas.openxmlformats.org/markup-compatibility/2006" xmlns:r="http://schemas.openxmlformats.org/officeDocument/2006/relationships" xmlns:w="http://schemas.openxmlformats.org/wordprocessingml/2006/main" xmlns:w14="http://schemas.microsoft.com/office/word/2010/wordml" xmlns:w15="http://schemas.microsoft.com/office/word/2012/wordml" xmlns:w16cid="http://schemas.microsoft.com/office/word/2016/wordml/cid" xmlns:w16se="http://schemas.microsoft.com/office/word/2015/wordml/symex" mc:Ignorable="w14 w15 w16se w16cid">
+<w:styles xmlns:mc="http://schemas.openxmlformats.org/markup-compatibility/2006" xmlns:r="http://schemas.openxmlformats.org/officeDocument/2006/relationships" xmlns:w="http://schemas.openxmlformats.org/wordprocessingml/2006/main" xmlns:w14="http://schemas.microsoft.com/office/word/2010/wordml" xmlns:w15="http://schemas.microsoft.com/office/word/2012/wordml" xmlns:w16cex="http://schemas.microsoft.com/office/word/2018/wordml/cex" xmlns:w16cid="http://schemas.microsoft.com/office/word/2016/wordml/cid" xmlns:w16="http://schemas.microsoft.com/office/word/2018/wordml" xmlns:w16du="http://schemas.microsoft.com/office/word/2023/wordml/word16du" xmlns:w16sdtdh="http://schemas.microsoft.com/office/word/2020/wordml/sdtdatahash" xmlns:w16sdtfl="http://schemas.microsoft.com/office/word/2024/wordml/sdtformatlock" xmlns:w16se="http://schemas.microsoft.com/office/word/2015/wordml/symex" mc:Ignorable="w14 w15 w16se w16cid w16 w16cex w16sdtdh w16sdtfl w16du">
   <w:docDefaults>
     <w:rPrDefault>
       <w:rPr>
@@ -40936,7 +41213,7 @@
       </w:pPr>
     </w:pPrDefault>
   </w:docDefaults>
-  <w:latentStyles w:defLockedState="0" w:defUIPriority="99" w:defSemiHidden="0" w:defUnhideWhenUsed="0" w:defQFormat="0" w:count="375">
+  <w:latentStyles w:defLockedState="0" w:defUIPriority="99" w:defSemiHidden="0" w:defUnhideWhenUsed="0" w:defQFormat="0" w:count="376">
     <w:lsdException w:name="Normal" w:uiPriority="0" w:qFormat="1"/>
     <w:lsdException w:name="heading 1" w:uiPriority="9" w:qFormat="1"/>
     <w:lsdException w:name="heading 2" w:semiHidden="1" w:uiPriority="9" w:unhideWhenUsed="1" w:qFormat="1"/>
@@ -41312,6 +41589,7 @@
     <w:lsdException w:name="Smart Hyperlink" w:semiHidden="1" w:unhideWhenUsed="1"/>
     <w:lsdException w:name="Hashtag" w:semiHidden="1" w:unhideWhenUsed="1"/>
     <w:lsdException w:name="Unresolved Mention" w:semiHidden="1" w:unhideWhenUsed="1"/>
+    <w:lsdException w:name="Smart Link" w:semiHidden="1" w:unhideWhenUsed="1"/>
   </w:latentStyles>
   <w:style w:type="paragraph" w:default="1" w:styleId="Normal">
     <w:name w:val="Normal"/>

</xml_diff>